<commit_message>
DOKU başvurusu: süre tablosu dolduruldu (ölçülen / tahmini etiketli)
Co-Authored-By: Claude Opus 5.5 <noreply@anthropic.com>
Claude-Session: https://claude.ai/code/session_01DmvdZ3JfGAfAXbGu1K9HZf
</commit_message>
<xml_diff>
--- a/IpAkisTopoloji/basvuru/DOKU_Basvuru.docx
+++ b/IpAkisTopoloji/basvuru/DOKU_Basvuru.docx
@@ -1388,7 +1388,7 @@
     </w:p>
     <w:p>
       <w:r>
-        <w:t>En büyük kazanç zamandır: birden çok ekip ve ekranla dakikalar-saatler süren inceleme, tek sorguda saniyelere iner. Tablodaki köşeli parantezli değerler başvurudan önce gerçek ölçümle doldurulmalıdır. DeltaFlow her sorgunun süresini ekranda gösterdiği için "sonra" sütunu birkaç örnek sorguyla kolayca ölçülür.</w:t>
+        <w:t>En büyük kazanç zamandır: birden çok ekip ve ekranla dakikalar-saatler süren inceleme, tek sorguda saniyelere iner. Bir sunucunun tüm bağımlılık resmi artık yaklaşık 20 saniyede çıkıyor; aynı iş elle saatler sürüyordu. "Ölçülen" değerler DeltaFlow ekranında görünen gerçek sorgu süresidir; "tahmini" değerler ekip deneyimine dayanır ve ölçüm yapıldıkça güncellenecektir.</w:t>
       </w:r>
     </w:p>
     <w:tbl>
@@ -1457,7 +1457,7 @@
                 <w:b/>
                 <w:sz w:val="19"/>
               </w:rPr>
-              <w:t>Sonra</w:t>
+              <w:t>Sonra (DOKU)</w:t>
             </w:r>
           </w:p>
         </w:tc>
@@ -1512,7 +1512,7 @@
               <w:rPr>
                 <w:sz w:val="19"/>
               </w:rPr>
-              <w:t>[30–90 dk, 4-5 ekran]</w:t>
+              <w:t>30–90 dk, 4-5 ekran (tahmini)</w:t>
             </w:r>
           </w:p>
         </w:tc>
@@ -1529,7 +1529,7 @@
               <w:rPr>
                 <w:sz w:val="19"/>
               </w:rPr>
-              <w:t>[Hızlı mod &lt; 2 sn, derin analiz 8–12 sn]</w:t>
+              <w:t>Hızlı mod 2 sn altı, derin analiz 8–12 sn (tahmini)</w:t>
             </w:r>
           </w:p>
         </w:tc>
@@ -1582,7 +1582,7 @@
               <w:rPr>
                 <w:sz w:val="19"/>
               </w:rPr>
-              <w:t>[__ hafta, atölye + anket + log]</w:t>
+              <w:t>2–4 hafta: atölye, anket, log inceleme (tahmini)</w:t>
             </w:r>
           </w:p>
         </w:tc>
@@ -1599,7 +1599,7 @@
               <w:rPr>
                 <w:sz w:val="19"/>
               </w:rPr>
-              <w:t>[__ gün, gerçek trafikten]</w:t>
+              <w:t>1–2 gün, gerçek trafikten (tahmini)</w:t>
             </w:r>
           </w:p>
         </w:tc>
@@ -1652,7 +1652,7 @@
               <w:rPr>
                 <w:sz w:val="19"/>
               </w:rPr>
-              <w:t>[__ saat, ağ + sistem ekibi]</w:t>
+              <w:t>2–4 saat, ağ + sistem ekibi (tahmini)</w:t>
             </w:r>
           </w:p>
         </w:tc>
@@ -1669,7 +1669,7 @@
               <w:rPr>
                 <w:sz w:val="19"/>
               </w:rPr>
-              <w:t>[__ sn, tek sorgu]</w:t>
+              <w:t>~20 sn, tek sorgu (ölçülen)</w:t>
             </w:r>
           </w:p>
         </w:tc>
@@ -1722,7 +1722,7 @@
               <w:rPr>
                 <w:sz w:val="19"/>
               </w:rPr>
-              <w:t>[__ saat/gün, toplantı + log]</w:t>
+              <w:t>1–2 gün, toplantı + log (tahmini)</w:t>
             </w:r>
           </w:p>
         </w:tc>
@@ -1739,7 +1739,7 @@
               <w:rPr>
                 <w:sz w:val="19"/>
               </w:rPr>
-              <w:t>[__ sn + AI yorumu]</w:t>
+              <w:t>1 dk altı, sorgu + yapay zeka kararı (tahmini)</w:t>
             </w:r>
           </w:p>
         </w:tc>
@@ -1792,7 +1792,7 @@
               <w:rPr>
                 <w:sz w:val="19"/>
               </w:rPr>
-              <w:t>[__ dk, firewall ekibine talep]</w:t>
+              <w:t>30 dk – 1 gün, firewall ekibine talep (tahmini)</w:t>
             </w:r>
           </w:p>
         </w:tc>
@@ -1809,7 +1809,7 @@
               <w:rPr>
                 <w:sz w:val="19"/>
               </w:rPr>
-              <w:t>[__ sn]</w:t>
+              <w:t>15–30 sn (tahmini)</w:t>
             </w:r>
           </w:p>
         </w:tc>
@@ -1862,7 +1862,7 @@
               <w:rPr>
                 <w:sz w:val="19"/>
               </w:rPr>
-              <w:t>[genelde yapılamıyor]</w:t>
+              <w:t>Pratikte yapılamıyordu</w:t>
             </w:r>
           </w:p>
         </w:tc>
@@ -1879,7 +1879,7 @@
               <w:rPr>
                 <w:sz w:val="19"/>
               </w:rPr>
-              <w:t>[__ sn]</w:t>
+              <w:t>~1 dk, Veri Akışı (tahmini)</w:t>
             </w:r>
           </w:p>
         </w:tc>
@@ -1932,7 +1932,7 @@
               <w:rPr>
                 <w:sz w:val="19"/>
               </w:rPr>
-              <w:t>[__ kayıt açıkta]</w:t>
+              <w:t>Kayıt başına 30–90 dk, çoğu hiç çözülmeden kalıyordu (tahmini)</w:t>
             </w:r>
           </w:p>
         </w:tc>
@@ -1949,7 +1949,7 @@
               <w:rPr>
                 <w:sz w:val="19"/>
               </w:rPr>
-              <w:t>[__ kayıt, %__ güvenle]</w:t>
+              <w:t>Kayıt başına saniyeler, yapay zeka kararı + güven skoru</w:t>
             </w:r>
           </w:p>
         </w:tc>
@@ -2710,7 +2710,7 @@
         <w:t xml:space="preserve">☐  </w:t>
       </w:r>
       <w:r>
-        <w:t>DeltaFlow satırları: 3–5 gerçek sorgunun ekranda görünen süresi tabloya girilmeli.</w:t>
+        <w:t>"Tahmini" yazan süreler 3–5 gerçek sorguyla ölçülüp "ölçülen" olarak güncellenmeli (DeltaFlow süreyi ekranda gösteriyor).</w:t>
       </w:r>
     </w:p>
     <w:p>

</xml_diff>